<commit_message>
Add layered architecture diagram + compliance traceability matrix
- build_diagrams.py: add layered architecture diagram (arch_layered.png)
  showing UI/ViewModel/Repository/data-source layers with real class names,
  the Main->IO thread boundary (withContext(Dispatchers.IO)), and Main/IO/
  Default dispatcher bands. Embedded as Figure 3.1 in the Final Report.
- build_compliance_traceability.py: new standalone deliverable mapping every
  requirement -> exact file/class/method -> how it complies; regenerated
  BTJ-ComplianceTraceability-...docx.
- Regenerate Final Report .docx with the new diagram.

Co-Authored-By: Claude Opus 4.8 (1M context) <noreply@anthropic.com>
</commit_message>
<xml_diff>
--- a/documents/BTJ-FinalReport-document-06-24-26-brandonGalli.docx
+++ b/documents/BTJ-FinalReport-document-06-24-26-brandonGalli.docx
@@ -3792,6 +3792,58 @@
         <w:t xml:space="preserve">  ServiceLocator (plain-Kotlin composition root) builds ApiService + AppDatabase</w:t>
         <w:br/>
         <w:t xml:space="preserve">  once and hands each ViewModel its repository interface. No DI framework.</w:t>
+      </w:r>
+    </w:p>
+    <w:p>
+      <w:pPr>
+        <w:jc w:val="center"/>
+      </w:pPr>
+      <w:r>
+        <w:drawing>
+          <wp:inline xmlns:a="http://schemas.openxmlformats.org/drawingml/2006/main" xmlns:pic="http://schemas.openxmlformats.org/drawingml/2006/picture">
+            <wp:extent cx="5943600" cy="4351948"/>
+            <wp:docPr id="1" name="Picture 1"/>
+            <wp:cNvGraphicFramePr>
+              <a:graphicFrameLocks noChangeAspect="1"/>
+            </wp:cNvGraphicFramePr>
+            <a:graphic>
+              <a:graphicData uri="http://schemas.openxmlformats.org/drawingml/2006/picture">
+                <pic:pic>
+                  <pic:nvPicPr>
+                    <pic:cNvPr id="0" name="arch_layered.png"/>
+                    <pic:cNvPicPr/>
+                  </pic:nvPicPr>
+                  <pic:blipFill>
+                    <a:blip r:embed="rId9"/>
+                    <a:stretch>
+                      <a:fillRect/>
+                    </a:stretch>
+                  </pic:blipFill>
+                  <pic:spPr>
+                    <a:xfrm>
+                      <a:off x="0" y="0"/>
+                      <a:ext cx="5943600" cy="4351948"/>
+                    </a:xfrm>
+                    <a:prstGeom prst="rect"/>
+                  </pic:spPr>
+                </pic:pic>
+              </a:graphicData>
+            </a:graphic>
+          </wp:inline>
+        </w:drawing>
+      </w:r>
+    </w:p>
+    <w:p>
+      <w:pPr>
+        <w:jc w:val="center"/>
+      </w:pPr>
+      <w:r>
+        <w:rPr>
+          <w:i/>
+          <w:color w:val="445566"/>
+          <w:sz w:val="18"/>
+        </w:rPr>
+        <w:t>Figure 3.1 — Layered architecture (as-built): UI → ViewModel → Repository → Room/network, with class names, the Main→IO thread boundary, and dispatcher bands.</w:t>
       </w:r>
     </w:p>
     <w:p>
@@ -5098,7 +5150,7 @@
         <w:drawing>
           <wp:inline xmlns:a="http://schemas.openxmlformats.org/drawingml/2006/main" xmlns:pic="http://schemas.openxmlformats.org/drawingml/2006/picture">
             <wp:extent cx="5120640" cy="2921892"/>
-            <wp:docPr id="1" name="Picture 1"/>
+            <wp:docPr id="2" name="Picture 2"/>
             <wp:cNvGraphicFramePr>
               <a:graphicFrameLocks noChangeAspect="1"/>
             </wp:cNvGraphicFramePr>
@@ -5110,7 +5162,7 @@
                     <pic:cNvPicPr/>
                   </pic:nvPicPr>
                   <pic:blipFill>
-                    <a:blip r:embed="rId9"/>
+                    <a:blip r:embed="rId10"/>
                     <a:stretch>
                       <a:fillRect/>
                     </a:stretch>
@@ -5150,7 +5202,7 @@
         <w:drawing>
           <wp:inline xmlns:a="http://schemas.openxmlformats.org/drawingml/2006/main" xmlns:pic="http://schemas.openxmlformats.org/drawingml/2006/picture">
             <wp:extent cx="5120640" cy="2921892"/>
-            <wp:docPr id="2" name="Picture 2"/>
+            <wp:docPr id="3" name="Picture 3"/>
             <wp:cNvGraphicFramePr>
               <a:graphicFrameLocks noChangeAspect="1"/>
             </wp:cNvGraphicFramePr>
@@ -5162,7 +5214,7 @@
                     <pic:cNvPicPr/>
                   </pic:nvPicPr>
                   <pic:blipFill>
-                    <a:blip r:embed="rId10"/>
+                    <a:blip r:embed="rId11"/>
                     <a:stretch>
                       <a:fillRect/>
                     </a:stretch>
@@ -5202,7 +5254,7 @@
         <w:drawing>
           <wp:inline xmlns:a="http://schemas.openxmlformats.org/drawingml/2006/main" xmlns:pic="http://schemas.openxmlformats.org/drawingml/2006/picture">
             <wp:extent cx="5120640" cy="2921892"/>
-            <wp:docPr id="3" name="Picture 3"/>
+            <wp:docPr id="4" name="Picture 4"/>
             <wp:cNvGraphicFramePr>
               <a:graphicFrameLocks noChangeAspect="1"/>
             </wp:cNvGraphicFramePr>
@@ -5214,7 +5266,7 @@
                     <pic:cNvPicPr/>
                   </pic:nvPicPr>
                   <pic:blipFill>
-                    <a:blip r:embed="rId11"/>
+                    <a:blip r:embed="rId12"/>
                     <a:stretch>
                       <a:fillRect/>
                     </a:stretch>
@@ -5254,7 +5306,7 @@
         <w:drawing>
           <wp:inline xmlns:a="http://schemas.openxmlformats.org/drawingml/2006/main" xmlns:pic="http://schemas.openxmlformats.org/drawingml/2006/picture">
             <wp:extent cx="5120640" cy="2921892"/>
-            <wp:docPr id="4" name="Picture 4"/>
+            <wp:docPr id="5" name="Picture 5"/>
             <wp:cNvGraphicFramePr>
               <a:graphicFrameLocks noChangeAspect="1"/>
             </wp:cNvGraphicFramePr>
@@ -5266,7 +5318,7 @@
                     <pic:cNvPicPr/>
                   </pic:nvPicPr>
                   <pic:blipFill>
-                    <a:blip r:embed="rId12"/>
+                    <a:blip r:embed="rId13"/>
                     <a:stretch>
                       <a:fillRect/>
                     </a:stretch>
@@ -5319,7 +5371,7 @@
         <w:drawing>
           <wp:inline xmlns:a="http://schemas.openxmlformats.org/drawingml/2006/main" xmlns:pic="http://schemas.openxmlformats.org/drawingml/2006/picture">
             <wp:extent cx="5669280" cy="7924512"/>
-            <wp:docPr id="5" name="Picture 5"/>
+            <wp:docPr id="6" name="Picture 6"/>
             <wp:cNvGraphicFramePr>
               <a:graphicFrameLocks noChangeAspect="1"/>
             </wp:cNvGraphicFramePr>
@@ -5331,7 +5383,7 @@
                     <pic:cNvPicPr/>
                   </pic:nvPicPr>
                   <pic:blipFill>
-                    <a:blip r:embed="rId13"/>
+                    <a:blip r:embed="rId14"/>
                     <a:stretch>
                       <a:fillRect/>
                     </a:stretch>
@@ -5371,7 +5423,7 @@
         <w:drawing>
           <wp:inline xmlns:a="http://schemas.openxmlformats.org/drawingml/2006/main" xmlns:pic="http://schemas.openxmlformats.org/drawingml/2006/picture">
             <wp:extent cx="5669280" cy="8962989"/>
-            <wp:docPr id="6" name="Picture 6"/>
+            <wp:docPr id="7" name="Picture 7"/>
             <wp:cNvGraphicFramePr>
               <a:graphicFrameLocks noChangeAspect="1"/>
             </wp:cNvGraphicFramePr>
@@ -5383,7 +5435,7 @@
                     <pic:cNvPicPr/>
                   </pic:nvPicPr>
                   <pic:blipFill>
-                    <a:blip r:embed="rId14"/>
+                    <a:blip r:embed="rId15"/>
                     <a:stretch>
                       <a:fillRect/>
                     </a:stretch>
@@ -5436,7 +5488,7 @@
         <w:drawing>
           <wp:inline xmlns:a="http://schemas.openxmlformats.org/drawingml/2006/main" xmlns:pic="http://schemas.openxmlformats.org/drawingml/2006/picture">
             <wp:extent cx="5669280" cy="4529980"/>
-            <wp:docPr id="7" name="Picture 7"/>
+            <wp:docPr id="8" name="Picture 8"/>
             <wp:cNvGraphicFramePr>
               <a:graphicFrameLocks noChangeAspect="1"/>
             </wp:cNvGraphicFramePr>
@@ -5448,7 +5500,7 @@
                     <pic:cNvPicPr/>
                   </pic:nvPicPr>
                   <pic:blipFill>
-                    <a:blip r:embed="rId15"/>
+                    <a:blip r:embed="rId16"/>
                     <a:stretch>
                       <a:fillRect/>
                     </a:stretch>
@@ -5488,7 +5540,7 @@
         <w:drawing>
           <wp:inline xmlns:a="http://schemas.openxmlformats.org/drawingml/2006/main" xmlns:pic="http://schemas.openxmlformats.org/drawingml/2006/picture">
             <wp:extent cx="4206240" cy="2287213"/>
-            <wp:docPr id="8" name="Picture 8"/>
+            <wp:docPr id="9" name="Picture 9"/>
             <wp:cNvGraphicFramePr>
               <a:graphicFrameLocks noChangeAspect="1"/>
             </wp:cNvGraphicFramePr>
@@ -5500,7 +5552,7 @@
                     <pic:cNvPicPr/>
                   </pic:nvPicPr>
                   <pic:blipFill>
-                    <a:blip r:embed="rId16"/>
+                    <a:blip r:embed="rId17"/>
                     <a:stretch>
                       <a:fillRect/>
                     </a:stretch>

</xml_diff>